<commit_message>
Close Phase 1 and the project in Shraga docs
Mark both phases closed and the project complete in Plan.md, record
adopted Phase 1 deviations and known issues (K1-K3, public repo accepted),
bump PRD to v1.4 (launched, dynamic Chart.js load, stricter CSP) and
DESIGN_SYSTEM to v1.2 (wrapping stat tiles), and regenerate the Word PRD.

Co-Authored-By: Claude Opus 5.5 <noreply@anthropic.com>
</commit_message>
<xml_diff>
--- a/shraga/Cal-Kesef-PRD.docx
+++ b/shraga/Cal-Kesef-PRD.docx
@@ -33,7 +33,7 @@
           <w:sz w:val="21"/>
           <w:szCs w:val="21"/>
         </w:rPr>
-        <w:t>Version: 1.3 Date: 2026-10-27 Build tool: Claude Code</w:t>
+        <w:t>Version: 1.4 Date: 2026-10-27 Status: Launched - https://kal-kesef-beige.vercel.app/ Build tool: Claude Code</w:t>
       </w:r>
     </w:p>
     <w:p>
@@ -4275,7 +4275,22 @@
                 <w:sz w:val="19"/>
                 <w:szCs w:val="19"/>
               </w:rPr>
-              <w:t>Chart.js 4.x, exact version pinned, loaded from cdnjs with SRI</w:t>
+              <w:t xml:space="preserve">Chart.js 4.5.1, exact version pinned, loaded from cdnjs with SRI + crossorigin, injected by </w:t>
+            </w:r>
+            <w:r>
+              <w:rPr>
+                <w:rStyle w:val="HTMLCode"/>
+              </w:rPr>
+              <w:t>js/app.js</w:t>
+            </w:r>
+            <w:r>
+              <w:rPr>
+                <w:rFonts w:ascii="Calibri" w:eastAsia="Times New Roman" w:hAnsi="Calibri" w:cs="Calibri"/>
+                <w:color w:val="1F2937"/>
+                <w:sz w:val="19"/>
+                <w:szCs w:val="19"/>
+              </w:rPr>
+              <w:t xml:space="preserve"> after the first render</w:t>
             </w:r>
           </w:p>
         </w:tc>
@@ -4313,7 +4328,7 @@
                 <w:sz w:val="19"/>
                 <w:szCs w:val="19"/>
               </w:rPr>
-              <w:t>Mature, accessible tooltips, touch support, one script tag</w:t>
+              <w:t>Mature, accessible tooltips, touch support; dynamic load keeps results independent of the CDN</w:t>
             </w:r>
           </w:p>
         </w:tc>
@@ -4644,7 +4659,16 @@
                 <w:sz w:val="19"/>
                 <w:szCs w:val="19"/>
               </w:rPr>
-              <w:t xml:space="preserve"> with a minimal assert helper; manual QA script</w:t>
+              <w:t xml:space="preserve"> </w:t>
+            </w:r>
+            <w:r>
+              <w:rPr>
+                <w:rFonts w:ascii="Calibri" w:eastAsia="Times New Roman" w:hAnsi="Calibri" w:cs="Calibri"/>
+                <w:color w:val="1F2937"/>
+                <w:sz w:val="19"/>
+                <w:szCs w:val="19"/>
+              </w:rPr>
+              <w:t>with a minimal assert helper; manual QA script</w:t>
             </w:r>
           </w:p>
         </w:tc>
@@ -5287,16 +5311,7 @@
           <w:sz w:val="21"/>
           <w:szCs w:val="21"/>
         </w:rPr>
-        <w:t xml:space="preserve">1. Design Goal - Playful, colorful and trustworthy. A teen should "get it" </w:t>
-      </w:r>
-      <w:r>
-        <w:rPr>
-          <w:rFonts w:ascii="Calibri" w:hAnsi="Calibri" w:cs="Calibri"/>
-          <w:color w:val="1F2937"/>
-          <w:sz w:val="21"/>
-          <w:szCs w:val="21"/>
-        </w:rPr>
-        <w:t>by moving one slider, and feel that saving is something they can do.</w:t>
+        <w:t>1. Design Goal - Playful, colorful and trustworthy. A teen should "get it" by moving one slider, and feel that saving is something they can do.</w:t>
       </w:r>
     </w:p>
     <w:p>
@@ -9825,6 +9840,131 @@
           </w:p>
         </w:tc>
       </w:tr>
+      <w:tr>
+        <w:tc>
+          <w:tcPr>
+            <w:tcW w:w="1667" w:type="pct"/>
+            <w:tcBorders>
+              <w:top w:val="single" w:sz="6" w:space="0" w:color="9CA3AF"/>
+              <w:left w:val="single" w:sz="6" w:space="0" w:color="9CA3AF"/>
+              <w:bottom w:val="single" w:sz="6" w:space="0" w:color="9CA3AF"/>
+              <w:right w:val="single" w:sz="6" w:space="0" w:color="9CA3AF"/>
+            </w:tcBorders>
+            <w:tcMar>
+              <w:top w:w="60" w:type="dxa"/>
+              <w:left w:w="100" w:type="dxa"/>
+              <w:bottom w:w="60" w:type="dxa"/>
+              <w:right w:w="100" w:type="dxa"/>
+            </w:tcMar>
+            <w:hideMark/>
+          </w:tcPr>
+          <w:p>
+            <w:pPr>
+              <w:spacing w:before="120" w:after="120"/>
+              <w:rPr>
+                <w:rFonts w:ascii="Calibri" w:eastAsia="Times New Roman" w:hAnsi="Calibri" w:cs="Calibri"/>
+                <w:color w:val="1F2937"/>
+                <w:sz w:val="19"/>
+                <w:szCs w:val="19"/>
+              </w:rPr>
+            </w:pPr>
+            <w:r>
+              <w:rPr>
+                <w:rFonts w:ascii="Calibri" w:eastAsia="Times New Roman" w:hAnsi="Calibri" w:cs="Calibri"/>
+                <w:color w:val="1F2937"/>
+                <w:sz w:val="19"/>
+                <w:szCs w:val="19"/>
+              </w:rPr>
+              <w:t>1.4</w:t>
+            </w:r>
+          </w:p>
+        </w:tc>
+        <w:tc>
+          <w:tcPr>
+            <w:tcW w:w="1667" w:type="pct"/>
+            <w:tcBorders>
+              <w:top w:val="single" w:sz="6" w:space="0" w:color="9CA3AF"/>
+              <w:left w:val="single" w:sz="6" w:space="0" w:color="9CA3AF"/>
+              <w:bottom w:val="single" w:sz="6" w:space="0" w:color="9CA3AF"/>
+              <w:right w:val="single" w:sz="6" w:space="0" w:color="9CA3AF"/>
+            </w:tcBorders>
+            <w:tcMar>
+              <w:top w:w="60" w:type="dxa"/>
+              <w:left w:w="100" w:type="dxa"/>
+              <w:bottom w:w="60" w:type="dxa"/>
+              <w:right w:w="100" w:type="dxa"/>
+            </w:tcMar>
+            <w:hideMark/>
+          </w:tcPr>
+          <w:p>
+            <w:pPr>
+              <w:spacing w:before="120" w:after="120"/>
+              <w:rPr>
+                <w:rFonts w:ascii="Calibri" w:eastAsia="Times New Roman" w:hAnsi="Calibri" w:cs="Calibri"/>
+                <w:color w:val="1F2937"/>
+                <w:sz w:val="19"/>
+                <w:szCs w:val="19"/>
+              </w:rPr>
+            </w:pPr>
+            <w:r>
+              <w:rPr>
+                <w:rFonts w:ascii="Calibri" w:eastAsia="Times New Roman" w:hAnsi="Calibri" w:cs="Calibri"/>
+                <w:color w:val="1F2937"/>
+                <w:sz w:val="19"/>
+                <w:szCs w:val="19"/>
+              </w:rPr>
+              <w:t>2026-10-27</w:t>
+            </w:r>
+          </w:p>
+        </w:tc>
+        <w:tc>
+          <w:tcPr>
+            <w:tcW w:w="1667" w:type="pct"/>
+            <w:tcBorders>
+              <w:top w:val="single" w:sz="6" w:space="0" w:color="9CA3AF"/>
+              <w:left w:val="single" w:sz="6" w:space="0" w:color="9CA3AF"/>
+              <w:bottom w:val="single" w:sz="6" w:space="0" w:color="9CA3AF"/>
+              <w:right w:val="single" w:sz="6" w:space="0" w:color="9CA3AF"/>
+            </w:tcBorders>
+            <w:tcMar>
+              <w:top w:w="60" w:type="dxa"/>
+              <w:left w:w="100" w:type="dxa"/>
+              <w:bottom w:w="60" w:type="dxa"/>
+              <w:right w:w="100" w:type="dxa"/>
+            </w:tcMar>
+            <w:hideMark/>
+          </w:tcPr>
+          <w:p>
+            <w:pPr>
+              <w:spacing w:before="120" w:after="120"/>
+              <w:rPr>
+                <w:rFonts w:ascii="Calibri" w:eastAsia="Times New Roman" w:hAnsi="Calibri" w:cs="Calibri"/>
+                <w:color w:val="1F2937"/>
+                <w:sz w:val="19"/>
+                <w:szCs w:val="19"/>
+              </w:rPr>
+            </w:pPr>
+            <w:r>
+              <w:rPr>
+                <w:rFonts w:ascii="Calibri" w:eastAsia="Times New Roman" w:hAnsi="Calibri" w:cs="Calibri"/>
+                <w:color w:val="1F2937"/>
+                <w:sz w:val="19"/>
+                <w:szCs w:val="19"/>
+              </w:rPr>
+              <w:t>Phase 1 closed, product launched on Vercel. Chart.js 4.5.1 injected dynamically by app.js (same SRI/crossorigin). Stricter CSP adopted (adds img-src 'self', connect-src 'none'</w:t>
+            </w:r>
+            <w:r>
+              <w:rPr>
+                <w:rFonts w:ascii="Calibri" w:eastAsia="Times New Roman" w:hAnsi="Calibri" w:cs="Calibri"/>
+                <w:color w:val="1F2937"/>
+                <w:sz w:val="19"/>
+                <w:szCs w:val="19"/>
+              </w:rPr>
+              <w:t>, form-action 'none').</w:t>
+            </w:r>
+          </w:p>
+        </w:tc>
+      </w:tr>
     </w:tbl>
     <w:p>
       <w:pPr>
@@ -9846,9 +9986,158 @@
 <file path=word/numbering.xml><?xml version="1.0" encoding="utf-8"?>
 <w:numbering xmlns:wpc="http://schemas.microsoft.com/office/word/2010/wordprocessingCanvas" xmlns:cx="http://schemas.microsoft.com/office/drawing/2014/chartex" xmlns:cx1="http://schemas.microsoft.com/office/drawing/2015/9/8/chartex" xmlns:cx2="http://schemas.microsoft.com/office/drawing/2015/10/21/chartex" xmlns:cx3="http://schemas.microsoft.com/office/drawing/2016/5/9/chartex" xmlns:cx4="http://schemas.microsoft.com/office/drawing/2016/5/10/chartex" xmlns:cx5="http://schemas.microsoft.com/office/drawing/2016/5/11/chartex" xmlns:cx6="http://schemas.microsoft.com/office/drawing/2016/5/12/chartex" xmlns:cx7="http://schemas.microsoft.com/office/drawing/2016/5/13/chartex" xmlns:cx8="http://schemas.microsoft.com/office/drawing/2016/5/14/chartex" xmlns:mc="http://schemas.openxmlformats.org/markup-compatibility/2006" xmlns:aink="http://schemas.microsoft.com/office/drawing/2016/ink" xmlns:am3d="http://schemas.microsoft.com/office/drawing/2017/model3d" xmlns:o="urn:schemas-microsoft-com:office:office" xmlns:oel="http://schemas.microsoft.com/office/2019/extlst" xmlns:r="http://schemas.openxmlformats.org/officeDocument/2006/relationships" xmlns:m="http://schemas.openxmlformats.org/officeDocument/2006/math" xmlns:v="urn:schemas-microsoft-com:vml" xmlns:wp14="http://schemas.microsoft.com/office/word/2010/wordprocessingDrawing" xmlns:wp="http://schemas.openxmlformats.org/drawingml/2006/wordprocessingDrawing" xmlns:w10="urn:schemas-microsoft-com:office:word" xmlns:w="http://schemas.openxmlformats.org/wordprocessingml/2006/main" xmlns:w14="http://schemas.microsoft.com/office/word/2010/wordml" xmlns:w15="http://schemas.microsoft.com/office/word/2012/wordml" xmlns:w16cex="http://schemas.microsoft.com/office/word/2018/wordml/cex" xmlns:w16cid="http://schemas.microsoft.com/office/word/2016/wordml/cid" xmlns:w16="http://schemas.microsoft.com/office/word/2018/wordml" xmlns:w16du="http://schemas.microsoft.com/office/word/2023/wordml/word16du" xmlns:w16sdtdh="http://schemas.microsoft.com/office/word/2020/wordml/sdtdatahash" xmlns:w16sdtfl="http://schemas.microsoft.com/office/word/2024/wordml/sdtformatlock" xmlns:w16se="http://schemas.microsoft.com/office/word/2015/wordml/symex" xmlns:wpg="http://schemas.microsoft.com/office/word/2010/wordprocessingGroup" xmlns:wpi="http://schemas.microsoft.com/office/word/2010/wordprocessingInk" xmlns:wne="http://schemas.microsoft.com/office/word/2006/wordml" xmlns:wps="http://schemas.microsoft.com/office/word/2010/wordprocessingShape" mc:Ignorable="w14 w15 w16se w16cid w16 w16cex w16sdtdh w16sdtfl w16du wp14">
   <w:abstractNum w:abstractNumId="0" w15:restartNumberingAfterBreak="0">
-    <w:nsid w:val="04F9649C"/>
+    <w:nsid w:val="1D765CEF"/>
     <w:multiLevelType w:val="multilevel"/>
-    <w:tmpl w:val="DDFEE9F6"/>
+    <w:tmpl w:val="F0941678"/>
+    <w:lvl w:ilvl="0">
+      <w:start w:val="1"/>
+      <w:numFmt w:val="bullet"/>
+      <w:lvlText w:val=""/>
+      <w:lvlJc w:val="left"/>
+      <w:pPr>
+        <w:tabs>
+          <w:tab w:val="num" w:pos="720"/>
+        </w:tabs>
+        <w:ind w:left="720" w:hanging="360"/>
+      </w:pPr>
+      <w:rPr>
+        <w:rFonts w:ascii="Symbol" w:hAnsi="Symbol" w:hint="default"/>
+        <w:sz w:val="20"/>
+      </w:rPr>
+    </w:lvl>
+    <w:lvl w:ilvl="1">
+      <w:start w:val="1"/>
+      <w:numFmt w:val="bullet"/>
+      <w:lvlText w:val="o"/>
+      <w:lvlJc w:val="left"/>
+      <w:pPr>
+        <w:tabs>
+          <w:tab w:val="num" w:pos="1440"/>
+        </w:tabs>
+        <w:ind w:left="1440" w:hanging="360"/>
+      </w:pPr>
+      <w:rPr>
+        <w:rFonts w:ascii="Courier New" w:hAnsi="Courier New" w:hint="default"/>
+        <w:sz w:val="20"/>
+      </w:rPr>
+    </w:lvl>
+    <w:lvl w:ilvl="2" w:tentative="1">
+      <w:start w:val="1"/>
+      <w:numFmt w:val="bullet"/>
+      <w:lvlText w:val=""/>
+      <w:lvlJc w:val="left"/>
+      <w:pPr>
+        <w:tabs>
+          <w:tab w:val="num" w:pos="2160"/>
+        </w:tabs>
+        <w:ind w:left="2160" w:hanging="360"/>
+      </w:pPr>
+      <w:rPr>
+        <w:rFonts w:ascii="Wingdings" w:hAnsi="Wingdings" w:hint="default"/>
+        <w:sz w:val="20"/>
+      </w:rPr>
+    </w:lvl>
+    <w:lvl w:ilvl="3" w:tentative="1">
+      <w:start w:val="1"/>
+      <w:numFmt w:val="bullet"/>
+      <w:lvlText w:val=""/>
+      <w:lvlJc w:val="left"/>
+      <w:pPr>
+        <w:tabs>
+          <w:tab w:val="num" w:pos="2880"/>
+        </w:tabs>
+        <w:ind w:left="2880" w:hanging="360"/>
+      </w:pPr>
+      <w:rPr>
+        <w:rFonts w:ascii="Wingdings" w:hAnsi="Wingdings" w:hint="default"/>
+        <w:sz w:val="20"/>
+      </w:rPr>
+    </w:lvl>
+    <w:lvl w:ilvl="4" w:tentative="1">
+      <w:start w:val="1"/>
+      <w:numFmt w:val="bullet"/>
+      <w:lvlText w:val=""/>
+      <w:lvlJc w:val="left"/>
+      <w:pPr>
+        <w:tabs>
+          <w:tab w:val="num" w:pos="3600"/>
+        </w:tabs>
+        <w:ind w:left="3600" w:hanging="360"/>
+      </w:pPr>
+      <w:rPr>
+        <w:rFonts w:ascii="Wingdings" w:hAnsi="Wingdings" w:hint="default"/>
+        <w:sz w:val="20"/>
+      </w:rPr>
+    </w:lvl>
+    <w:lvl w:ilvl="5" w:tentative="1">
+      <w:start w:val="1"/>
+      <w:numFmt w:val="bullet"/>
+      <w:lvlText w:val=""/>
+      <w:lvlJc w:val="left"/>
+      <w:pPr>
+        <w:tabs>
+          <w:tab w:val="num" w:pos="4320"/>
+        </w:tabs>
+        <w:ind w:left="4320" w:hanging="360"/>
+      </w:pPr>
+      <w:rPr>
+        <w:rFonts w:ascii="Wingdings" w:hAnsi="Wingdings" w:hint="default"/>
+        <w:sz w:val="20"/>
+      </w:rPr>
+    </w:lvl>
+    <w:lvl w:ilvl="6" w:tentative="1">
+      <w:start w:val="1"/>
+      <w:numFmt w:val="bullet"/>
+      <w:lvlText w:val=""/>
+      <w:lvlJc w:val="left"/>
+      <w:pPr>
+        <w:tabs>
+          <w:tab w:val="num" w:pos="5040"/>
+        </w:tabs>
+        <w:ind w:left="5040" w:hanging="360"/>
+      </w:pPr>
+      <w:rPr>
+        <w:rFonts w:ascii="Wingdings" w:hAnsi="Wingdings" w:hint="default"/>
+        <w:sz w:val="20"/>
+      </w:rPr>
+    </w:lvl>
+    <w:lvl w:ilvl="7" w:tentative="1">
+      <w:start w:val="1"/>
+      <w:numFmt w:val="bullet"/>
+      <w:lvlText w:val=""/>
+      <w:lvlJc w:val="left"/>
+      <w:pPr>
+        <w:tabs>
+          <w:tab w:val="num" w:pos="5760"/>
+        </w:tabs>
+        <w:ind w:left="5760" w:hanging="360"/>
+      </w:pPr>
+      <w:rPr>
+        <w:rFonts w:ascii="Wingdings" w:hAnsi="Wingdings" w:hint="default"/>
+        <w:sz w:val="20"/>
+      </w:rPr>
+    </w:lvl>
+    <w:lvl w:ilvl="8" w:tentative="1">
+      <w:start w:val="1"/>
+      <w:numFmt w:val="bullet"/>
+      <w:lvlText w:val=""/>
+      <w:lvlJc w:val="left"/>
+      <w:pPr>
+        <w:tabs>
+          <w:tab w:val="num" w:pos="6480"/>
+        </w:tabs>
+        <w:ind w:left="6480" w:hanging="360"/>
+      </w:pPr>
+      <w:rPr>
+        <w:rFonts w:ascii="Wingdings" w:hAnsi="Wingdings" w:hint="default"/>
+        <w:sz w:val="20"/>
+      </w:rPr>
+    </w:lvl>
+  </w:abstractNum>
+  <w:abstractNum w:abstractNumId="1" w15:restartNumberingAfterBreak="0">
+    <w:nsid w:val="20C1536E"/>
+    <w:multiLevelType w:val="multilevel"/>
+    <w:tmpl w:val="D0529794"/>
     <w:lvl w:ilvl="0">
       <w:start w:val="1"/>
       <w:numFmt w:val="bullet"/>
@@ -9994,10 +10283,159 @@
       </w:rPr>
     </w:lvl>
   </w:abstractNum>
-  <w:abstractNum w:abstractNumId="1" w15:restartNumberingAfterBreak="0">
-    <w:nsid w:val="08817FC2"/>
+  <w:abstractNum w:abstractNumId="2" w15:restartNumberingAfterBreak="0">
+    <w:nsid w:val="2790724A"/>
     <w:multiLevelType w:val="multilevel"/>
-    <w:tmpl w:val="2E700D68"/>
+    <w:tmpl w:val="893C3720"/>
+    <w:lvl w:ilvl="0">
+      <w:start w:val="1"/>
+      <w:numFmt w:val="bullet"/>
+      <w:lvlText w:val=""/>
+      <w:lvlJc w:val="left"/>
+      <w:pPr>
+        <w:tabs>
+          <w:tab w:val="num" w:pos="720"/>
+        </w:tabs>
+        <w:ind w:left="720" w:hanging="360"/>
+      </w:pPr>
+      <w:rPr>
+        <w:rFonts w:ascii="Symbol" w:hAnsi="Symbol" w:hint="default"/>
+        <w:sz w:val="20"/>
+      </w:rPr>
+    </w:lvl>
+    <w:lvl w:ilvl="1">
+      <w:start w:val="1"/>
+      <w:numFmt w:val="bullet"/>
+      <w:lvlText w:val="o"/>
+      <w:lvlJc w:val="left"/>
+      <w:pPr>
+        <w:tabs>
+          <w:tab w:val="num" w:pos="1440"/>
+        </w:tabs>
+        <w:ind w:left="1440" w:hanging="360"/>
+      </w:pPr>
+      <w:rPr>
+        <w:rFonts w:ascii="Courier New" w:hAnsi="Courier New" w:hint="default"/>
+        <w:sz w:val="20"/>
+      </w:rPr>
+    </w:lvl>
+    <w:lvl w:ilvl="2" w:tentative="1">
+      <w:start w:val="1"/>
+      <w:numFmt w:val="bullet"/>
+      <w:lvlText w:val=""/>
+      <w:lvlJc w:val="left"/>
+      <w:pPr>
+        <w:tabs>
+          <w:tab w:val="num" w:pos="2160"/>
+        </w:tabs>
+        <w:ind w:left="2160" w:hanging="360"/>
+      </w:pPr>
+      <w:rPr>
+        <w:rFonts w:ascii="Wingdings" w:hAnsi="Wingdings" w:hint="default"/>
+        <w:sz w:val="20"/>
+      </w:rPr>
+    </w:lvl>
+    <w:lvl w:ilvl="3" w:tentative="1">
+      <w:start w:val="1"/>
+      <w:numFmt w:val="bullet"/>
+      <w:lvlText w:val=""/>
+      <w:lvlJc w:val="left"/>
+      <w:pPr>
+        <w:tabs>
+          <w:tab w:val="num" w:pos="2880"/>
+        </w:tabs>
+        <w:ind w:left="2880" w:hanging="360"/>
+      </w:pPr>
+      <w:rPr>
+        <w:rFonts w:ascii="Wingdings" w:hAnsi="Wingdings" w:hint="default"/>
+        <w:sz w:val="20"/>
+      </w:rPr>
+    </w:lvl>
+    <w:lvl w:ilvl="4" w:tentative="1">
+      <w:start w:val="1"/>
+      <w:numFmt w:val="bullet"/>
+      <w:lvlText w:val=""/>
+      <w:lvlJc w:val="left"/>
+      <w:pPr>
+        <w:tabs>
+          <w:tab w:val="num" w:pos="3600"/>
+        </w:tabs>
+        <w:ind w:left="3600" w:hanging="360"/>
+      </w:pPr>
+      <w:rPr>
+        <w:rFonts w:ascii="Wingdings" w:hAnsi="Wingdings" w:hint="default"/>
+        <w:sz w:val="20"/>
+      </w:rPr>
+    </w:lvl>
+    <w:lvl w:ilvl="5" w:tentative="1">
+      <w:start w:val="1"/>
+      <w:numFmt w:val="bullet"/>
+      <w:lvlText w:val=""/>
+      <w:lvlJc w:val="left"/>
+      <w:pPr>
+        <w:tabs>
+          <w:tab w:val="num" w:pos="4320"/>
+        </w:tabs>
+        <w:ind w:left="4320" w:hanging="360"/>
+      </w:pPr>
+      <w:rPr>
+        <w:rFonts w:ascii="Wingdings" w:hAnsi="Wingdings" w:hint="default"/>
+        <w:sz w:val="20"/>
+      </w:rPr>
+    </w:lvl>
+    <w:lvl w:ilvl="6" w:tentative="1">
+      <w:start w:val="1"/>
+      <w:numFmt w:val="bullet"/>
+      <w:lvlText w:val=""/>
+      <w:lvlJc w:val="left"/>
+      <w:pPr>
+        <w:tabs>
+          <w:tab w:val="num" w:pos="5040"/>
+        </w:tabs>
+        <w:ind w:left="5040" w:hanging="360"/>
+      </w:pPr>
+      <w:rPr>
+        <w:rFonts w:ascii="Wingdings" w:hAnsi="Wingdings" w:hint="default"/>
+        <w:sz w:val="20"/>
+      </w:rPr>
+    </w:lvl>
+    <w:lvl w:ilvl="7" w:tentative="1">
+      <w:start w:val="1"/>
+      <w:numFmt w:val="bullet"/>
+      <w:lvlText w:val=""/>
+      <w:lvlJc w:val="left"/>
+      <w:pPr>
+        <w:tabs>
+          <w:tab w:val="num" w:pos="5760"/>
+        </w:tabs>
+        <w:ind w:left="5760" w:hanging="360"/>
+      </w:pPr>
+      <w:rPr>
+        <w:rFonts w:ascii="Wingdings" w:hAnsi="Wingdings" w:hint="default"/>
+        <w:sz w:val="20"/>
+      </w:rPr>
+    </w:lvl>
+    <w:lvl w:ilvl="8" w:tentative="1">
+      <w:start w:val="1"/>
+      <w:numFmt w:val="bullet"/>
+      <w:lvlText w:val=""/>
+      <w:lvlJc w:val="left"/>
+      <w:pPr>
+        <w:tabs>
+          <w:tab w:val="num" w:pos="6480"/>
+        </w:tabs>
+        <w:ind w:left="6480" w:hanging="360"/>
+      </w:pPr>
+      <w:rPr>
+        <w:rFonts w:ascii="Wingdings" w:hAnsi="Wingdings" w:hint="default"/>
+        <w:sz w:val="20"/>
+      </w:rPr>
+    </w:lvl>
+  </w:abstractNum>
+  <w:abstractNum w:abstractNumId="3" w15:restartNumberingAfterBreak="0">
+    <w:nsid w:val="2919624D"/>
+    <w:multiLevelType w:val="multilevel"/>
+    <w:tmpl w:val="D5D61C14"/>
     <w:lvl w:ilvl="0">
       <w:start w:val="1"/>
       <w:numFmt w:val="bullet"/>
@@ -10143,10 +10581,10 @@
       </w:rPr>
     </w:lvl>
   </w:abstractNum>
-  <w:abstractNum w:abstractNumId="2" w15:restartNumberingAfterBreak="0">
-    <w:nsid w:val="0CF420AF"/>
+  <w:abstractNum w:abstractNumId="4" w15:restartNumberingAfterBreak="0">
+    <w:nsid w:val="29B253D6"/>
     <w:multiLevelType w:val="multilevel"/>
-    <w:tmpl w:val="1B004470"/>
+    <w:tmpl w:val="E45ACC0C"/>
     <w:lvl w:ilvl="0">
       <w:start w:val="1"/>
       <w:numFmt w:val="bullet"/>
@@ -10163,7 +10601,7 @@
         <w:sz w:val="20"/>
       </w:rPr>
     </w:lvl>
-    <w:lvl w:ilvl="1">
+    <w:lvl w:ilvl="1" w:tentative="1">
       <w:start w:val="1"/>
       <w:numFmt w:val="bullet"/>
       <w:lvlText w:val="o"/>
@@ -10292,10 +10730,10 @@
       </w:rPr>
     </w:lvl>
   </w:abstractNum>
-  <w:abstractNum w:abstractNumId="3" w15:restartNumberingAfterBreak="0">
-    <w:nsid w:val="1CB749C4"/>
+  <w:abstractNum w:abstractNumId="5" w15:restartNumberingAfterBreak="0">
+    <w:nsid w:val="48675FDD"/>
     <w:multiLevelType w:val="multilevel"/>
-    <w:tmpl w:val="58FE794E"/>
+    <w:tmpl w:val="FECC7BD6"/>
     <w:lvl w:ilvl="0">
       <w:start w:val="1"/>
       <w:numFmt w:val="bullet"/>
@@ -10441,10 +10879,10 @@
       </w:rPr>
     </w:lvl>
   </w:abstractNum>
-  <w:abstractNum w:abstractNumId="4" w15:restartNumberingAfterBreak="0">
-    <w:nsid w:val="2D293543"/>
+  <w:abstractNum w:abstractNumId="6" w15:restartNumberingAfterBreak="0">
+    <w:nsid w:val="48885C2D"/>
     <w:multiLevelType w:val="multilevel"/>
-    <w:tmpl w:val="E9A060B6"/>
+    <w:tmpl w:val="DBCCB2C4"/>
     <w:lvl w:ilvl="0">
       <w:start w:val="1"/>
       <w:numFmt w:val="bullet"/>
@@ -10590,10 +11028,10 @@
       </w:rPr>
     </w:lvl>
   </w:abstractNum>
-  <w:abstractNum w:abstractNumId="5" w15:restartNumberingAfterBreak="0">
-    <w:nsid w:val="34224328"/>
+  <w:abstractNum w:abstractNumId="7" w15:restartNumberingAfterBreak="0">
+    <w:nsid w:val="55CC4CA9"/>
     <w:multiLevelType w:val="multilevel"/>
-    <w:tmpl w:val="2CD8B9C0"/>
+    <w:tmpl w:val="6DBAED24"/>
     <w:lvl w:ilvl="0">
       <w:start w:val="1"/>
       <w:numFmt w:val="bullet"/>
@@ -10739,10 +11177,10 @@
       </w:rPr>
     </w:lvl>
   </w:abstractNum>
-  <w:abstractNum w:abstractNumId="6" w15:restartNumberingAfterBreak="0">
-    <w:nsid w:val="3A870388"/>
+  <w:abstractNum w:abstractNumId="8" w15:restartNumberingAfterBreak="0">
+    <w:nsid w:val="691D4C3A"/>
     <w:multiLevelType w:val="multilevel"/>
-    <w:tmpl w:val="5EAA1680"/>
+    <w:tmpl w:val="1C648DBE"/>
     <w:lvl w:ilvl="0">
       <w:start w:val="1"/>
       <w:numFmt w:val="bullet"/>
@@ -10888,10 +11326,10 @@
       </w:rPr>
     </w:lvl>
   </w:abstractNum>
-  <w:abstractNum w:abstractNumId="7" w15:restartNumberingAfterBreak="0">
-    <w:nsid w:val="42155C79"/>
+  <w:abstractNum w:abstractNumId="9" w15:restartNumberingAfterBreak="0">
+    <w:nsid w:val="73EA1E05"/>
     <w:multiLevelType w:val="multilevel"/>
-    <w:tmpl w:val="B100E430"/>
+    <w:tmpl w:val="BDD2B86E"/>
     <w:lvl w:ilvl="0">
       <w:start w:val="1"/>
       <w:numFmt w:val="bullet"/>
@@ -10908,7 +11346,7 @@
         <w:sz w:val="20"/>
       </w:rPr>
     </w:lvl>
-    <w:lvl w:ilvl="1">
+    <w:lvl w:ilvl="1" w:tentative="1">
       <w:start w:val="1"/>
       <w:numFmt w:val="bullet"/>
       <w:lvlText w:val="o"/>
@@ -11037,333 +11475,35 @@
       </w:rPr>
     </w:lvl>
   </w:abstractNum>
-  <w:abstractNum w:abstractNumId="8" w15:restartNumberingAfterBreak="0">
-    <w:nsid w:val="46561CA6"/>
-    <w:multiLevelType w:val="multilevel"/>
-    <w:tmpl w:val="A06026A8"/>
-    <w:lvl w:ilvl="0">
-      <w:start w:val="1"/>
-      <w:numFmt w:val="bullet"/>
-      <w:lvlText w:val=""/>
-      <w:lvlJc w:val="left"/>
-      <w:pPr>
-        <w:tabs>
-          <w:tab w:val="num" w:pos="720"/>
-        </w:tabs>
-        <w:ind w:left="720" w:hanging="360"/>
-      </w:pPr>
-      <w:rPr>
-        <w:rFonts w:ascii="Symbol" w:hAnsi="Symbol" w:hint="default"/>
-        <w:sz w:val="20"/>
-      </w:rPr>
-    </w:lvl>
-    <w:lvl w:ilvl="1" w:tentative="1">
-      <w:start w:val="1"/>
-      <w:numFmt w:val="bullet"/>
-      <w:lvlText w:val="o"/>
-      <w:lvlJc w:val="left"/>
-      <w:pPr>
-        <w:tabs>
-          <w:tab w:val="num" w:pos="1440"/>
-        </w:tabs>
-        <w:ind w:left="1440" w:hanging="360"/>
-      </w:pPr>
-      <w:rPr>
-        <w:rFonts w:ascii="Courier New" w:hAnsi="Courier New" w:hint="default"/>
-        <w:sz w:val="20"/>
-      </w:rPr>
-    </w:lvl>
-    <w:lvl w:ilvl="2" w:tentative="1">
-      <w:start w:val="1"/>
-      <w:numFmt w:val="bullet"/>
-      <w:lvlText w:val=""/>
-      <w:lvlJc w:val="left"/>
-      <w:pPr>
-        <w:tabs>
-          <w:tab w:val="num" w:pos="2160"/>
-        </w:tabs>
-        <w:ind w:left="2160" w:hanging="360"/>
-      </w:pPr>
-      <w:rPr>
-        <w:rFonts w:ascii="Wingdings" w:hAnsi="Wingdings" w:hint="default"/>
-        <w:sz w:val="20"/>
-      </w:rPr>
-    </w:lvl>
-    <w:lvl w:ilvl="3" w:tentative="1">
-      <w:start w:val="1"/>
-      <w:numFmt w:val="bullet"/>
-      <w:lvlText w:val=""/>
-      <w:lvlJc w:val="left"/>
-      <w:pPr>
-        <w:tabs>
-          <w:tab w:val="num" w:pos="2880"/>
-        </w:tabs>
-        <w:ind w:left="2880" w:hanging="360"/>
-      </w:pPr>
-      <w:rPr>
-        <w:rFonts w:ascii="Wingdings" w:hAnsi="Wingdings" w:hint="default"/>
-        <w:sz w:val="20"/>
-      </w:rPr>
-    </w:lvl>
-    <w:lvl w:ilvl="4" w:tentative="1">
-      <w:start w:val="1"/>
-      <w:numFmt w:val="bullet"/>
-      <w:lvlText w:val=""/>
-      <w:lvlJc w:val="left"/>
-      <w:pPr>
-        <w:tabs>
-          <w:tab w:val="num" w:pos="3600"/>
-        </w:tabs>
-        <w:ind w:left="3600" w:hanging="360"/>
-      </w:pPr>
-      <w:rPr>
-        <w:rFonts w:ascii="Wingdings" w:hAnsi="Wingdings" w:hint="default"/>
-        <w:sz w:val="20"/>
-      </w:rPr>
-    </w:lvl>
-    <w:lvl w:ilvl="5" w:tentative="1">
-      <w:start w:val="1"/>
-      <w:numFmt w:val="bullet"/>
-      <w:lvlText w:val=""/>
-      <w:lvlJc w:val="left"/>
-      <w:pPr>
-        <w:tabs>
-          <w:tab w:val="num" w:pos="4320"/>
-        </w:tabs>
-        <w:ind w:left="4320" w:hanging="360"/>
-      </w:pPr>
-      <w:rPr>
-        <w:rFonts w:ascii="Wingdings" w:hAnsi="Wingdings" w:hint="default"/>
-        <w:sz w:val="20"/>
-      </w:rPr>
-    </w:lvl>
-    <w:lvl w:ilvl="6" w:tentative="1">
-      <w:start w:val="1"/>
-      <w:numFmt w:val="bullet"/>
-      <w:lvlText w:val=""/>
-      <w:lvlJc w:val="left"/>
-      <w:pPr>
-        <w:tabs>
-          <w:tab w:val="num" w:pos="5040"/>
-        </w:tabs>
-        <w:ind w:left="5040" w:hanging="360"/>
-      </w:pPr>
-      <w:rPr>
-        <w:rFonts w:ascii="Wingdings" w:hAnsi="Wingdings" w:hint="default"/>
-        <w:sz w:val="20"/>
-      </w:rPr>
-    </w:lvl>
-    <w:lvl w:ilvl="7" w:tentative="1">
-      <w:start w:val="1"/>
-      <w:numFmt w:val="bullet"/>
-      <w:lvlText w:val=""/>
-      <w:lvlJc w:val="left"/>
-      <w:pPr>
-        <w:tabs>
-          <w:tab w:val="num" w:pos="5760"/>
-        </w:tabs>
-        <w:ind w:left="5760" w:hanging="360"/>
-      </w:pPr>
-      <w:rPr>
-        <w:rFonts w:ascii="Wingdings" w:hAnsi="Wingdings" w:hint="default"/>
-        <w:sz w:val="20"/>
-      </w:rPr>
-    </w:lvl>
-    <w:lvl w:ilvl="8" w:tentative="1">
-      <w:start w:val="1"/>
-      <w:numFmt w:val="bullet"/>
-      <w:lvlText w:val=""/>
-      <w:lvlJc w:val="left"/>
-      <w:pPr>
-        <w:tabs>
-          <w:tab w:val="num" w:pos="6480"/>
-        </w:tabs>
-        <w:ind w:left="6480" w:hanging="360"/>
-      </w:pPr>
-      <w:rPr>
-        <w:rFonts w:ascii="Wingdings" w:hAnsi="Wingdings" w:hint="default"/>
-        <w:sz w:val="20"/>
-      </w:rPr>
-    </w:lvl>
-  </w:abstractNum>
-  <w:abstractNum w:abstractNumId="9" w15:restartNumberingAfterBreak="0">
-    <w:nsid w:val="524F614D"/>
-    <w:multiLevelType w:val="multilevel"/>
-    <w:tmpl w:val="14E048F8"/>
-    <w:lvl w:ilvl="0">
-      <w:start w:val="1"/>
-      <w:numFmt w:val="bullet"/>
-      <w:lvlText w:val=""/>
-      <w:lvlJc w:val="left"/>
-      <w:pPr>
-        <w:tabs>
-          <w:tab w:val="num" w:pos="720"/>
-        </w:tabs>
-        <w:ind w:left="720" w:hanging="360"/>
-      </w:pPr>
-      <w:rPr>
-        <w:rFonts w:ascii="Symbol" w:hAnsi="Symbol" w:hint="default"/>
-        <w:sz w:val="20"/>
-      </w:rPr>
-    </w:lvl>
-    <w:lvl w:ilvl="1" w:tentative="1">
-      <w:start w:val="1"/>
-      <w:numFmt w:val="bullet"/>
-      <w:lvlText w:val="o"/>
-      <w:lvlJc w:val="left"/>
-      <w:pPr>
-        <w:tabs>
-          <w:tab w:val="num" w:pos="1440"/>
-        </w:tabs>
-        <w:ind w:left="1440" w:hanging="360"/>
-      </w:pPr>
-      <w:rPr>
-        <w:rFonts w:ascii="Courier New" w:hAnsi="Courier New" w:hint="default"/>
-        <w:sz w:val="20"/>
-      </w:rPr>
-    </w:lvl>
-    <w:lvl w:ilvl="2" w:tentative="1">
-      <w:start w:val="1"/>
-      <w:numFmt w:val="bullet"/>
-      <w:lvlText w:val=""/>
-      <w:lvlJc w:val="left"/>
-      <w:pPr>
-        <w:tabs>
-          <w:tab w:val="num" w:pos="2160"/>
-        </w:tabs>
-        <w:ind w:left="2160" w:hanging="360"/>
-      </w:pPr>
-      <w:rPr>
-        <w:rFonts w:ascii="Wingdings" w:hAnsi="Wingdings" w:hint="default"/>
-        <w:sz w:val="20"/>
-      </w:rPr>
-    </w:lvl>
-    <w:lvl w:ilvl="3" w:tentative="1">
-      <w:start w:val="1"/>
-      <w:numFmt w:val="bullet"/>
-      <w:lvlText w:val=""/>
-      <w:lvlJc w:val="left"/>
-      <w:pPr>
-        <w:tabs>
-          <w:tab w:val="num" w:pos="2880"/>
-        </w:tabs>
-        <w:ind w:left="2880" w:hanging="360"/>
-      </w:pPr>
-      <w:rPr>
-        <w:rFonts w:ascii="Wingdings" w:hAnsi="Wingdings" w:hint="default"/>
-        <w:sz w:val="20"/>
-      </w:rPr>
-    </w:lvl>
-    <w:lvl w:ilvl="4" w:tentative="1">
-      <w:start w:val="1"/>
-      <w:numFmt w:val="bullet"/>
-      <w:lvlText w:val=""/>
-      <w:lvlJc w:val="left"/>
-      <w:pPr>
-        <w:tabs>
-          <w:tab w:val="num" w:pos="3600"/>
-        </w:tabs>
-        <w:ind w:left="3600" w:hanging="360"/>
-      </w:pPr>
-      <w:rPr>
-        <w:rFonts w:ascii="Wingdings" w:hAnsi="Wingdings" w:hint="default"/>
-        <w:sz w:val="20"/>
-      </w:rPr>
-    </w:lvl>
-    <w:lvl w:ilvl="5" w:tentative="1">
-      <w:start w:val="1"/>
-      <w:numFmt w:val="bullet"/>
-      <w:lvlText w:val=""/>
-      <w:lvlJc w:val="left"/>
-      <w:pPr>
-        <w:tabs>
-          <w:tab w:val="num" w:pos="4320"/>
-        </w:tabs>
-        <w:ind w:left="4320" w:hanging="360"/>
-      </w:pPr>
-      <w:rPr>
-        <w:rFonts w:ascii="Wingdings" w:hAnsi="Wingdings" w:hint="default"/>
-        <w:sz w:val="20"/>
-      </w:rPr>
-    </w:lvl>
-    <w:lvl w:ilvl="6" w:tentative="1">
-      <w:start w:val="1"/>
-      <w:numFmt w:val="bullet"/>
-      <w:lvlText w:val=""/>
-      <w:lvlJc w:val="left"/>
-      <w:pPr>
-        <w:tabs>
-          <w:tab w:val="num" w:pos="5040"/>
-        </w:tabs>
-        <w:ind w:left="5040" w:hanging="360"/>
-      </w:pPr>
-      <w:rPr>
-        <w:rFonts w:ascii="Wingdings" w:hAnsi="Wingdings" w:hint="default"/>
-        <w:sz w:val="20"/>
-      </w:rPr>
-    </w:lvl>
-    <w:lvl w:ilvl="7" w:tentative="1">
-      <w:start w:val="1"/>
-      <w:numFmt w:val="bullet"/>
-      <w:lvlText w:val=""/>
-      <w:lvlJc w:val="left"/>
-      <w:pPr>
-        <w:tabs>
-          <w:tab w:val="num" w:pos="5760"/>
-        </w:tabs>
-        <w:ind w:left="5760" w:hanging="360"/>
-      </w:pPr>
-      <w:rPr>
-        <w:rFonts w:ascii="Wingdings" w:hAnsi="Wingdings" w:hint="default"/>
-        <w:sz w:val="20"/>
-      </w:rPr>
-    </w:lvl>
-    <w:lvl w:ilvl="8" w:tentative="1">
-      <w:start w:val="1"/>
-      <w:numFmt w:val="bullet"/>
-      <w:lvlText w:val=""/>
-      <w:lvlJc w:val="left"/>
-      <w:pPr>
-        <w:tabs>
-          <w:tab w:val="num" w:pos="6480"/>
-        </w:tabs>
-        <w:ind w:left="6480" w:hanging="360"/>
-      </w:pPr>
-      <w:rPr>
-        <w:rFonts w:ascii="Wingdings" w:hAnsi="Wingdings" w:hint="default"/>
-        <w:sz w:val="20"/>
-      </w:rPr>
-    </w:lvl>
-  </w:abstractNum>
-  <w:num w:numId="1" w16cid:durableId="1456410028">
+  <w:num w:numId="1" w16cid:durableId="1138381433">
+    <w:abstractNumId w:val="1"/>
+  </w:num>
+  <w:num w:numId="2" w16cid:durableId="1226181644">
+    <w:abstractNumId w:val="3"/>
+  </w:num>
+  <w:num w:numId="3" w16cid:durableId="572592248">
+    <w:abstractNumId w:val="5"/>
+  </w:num>
+  <w:num w:numId="4" w16cid:durableId="1037661828">
+    <w:abstractNumId w:val="0"/>
+  </w:num>
+  <w:num w:numId="5" w16cid:durableId="1672874207">
+    <w:abstractNumId w:val="9"/>
+  </w:num>
+  <w:num w:numId="6" w16cid:durableId="296646935">
+    <w:abstractNumId w:val="8"/>
+  </w:num>
+  <w:num w:numId="7" w16cid:durableId="1148982231">
     <w:abstractNumId w:val="4"/>
   </w:num>
-  <w:num w:numId="2" w16cid:durableId="1120681177">
-    <w:abstractNumId w:val="6"/>
-  </w:num>
-  <w:num w:numId="3" w16cid:durableId="369458729">
-    <w:abstractNumId w:val="0"/>
-  </w:num>
-  <w:num w:numId="4" w16cid:durableId="1321664588">
+  <w:num w:numId="8" w16cid:durableId="113598129">
     <w:abstractNumId w:val="7"/>
   </w:num>
-  <w:num w:numId="5" w16cid:durableId="294608627">
-    <w:abstractNumId w:val="3"/>
-  </w:num>
-  <w:num w:numId="6" w16cid:durableId="1114328564">
-    <w:abstractNumId w:val="5"/>
-  </w:num>
-  <w:num w:numId="7" w16cid:durableId="857157159">
-    <w:abstractNumId w:val="8"/>
-  </w:num>
-  <w:num w:numId="8" w16cid:durableId="1597471745">
-    <w:abstractNumId w:val="9"/>
-  </w:num>
-  <w:num w:numId="9" w16cid:durableId="2094932059">
+  <w:num w:numId="9" w16cid:durableId="195705010">
     <w:abstractNumId w:val="2"/>
   </w:num>
-  <w:num w:numId="10" w16cid:durableId="1296444114">
-    <w:abstractNumId w:val="1"/>
+  <w:num w:numId="10" w16cid:durableId="1212418725">
+    <w:abstractNumId w:val="6"/>
   </w:num>
 </w:numbering>
 </file>

</xml_diff>